<commit_message>
Supplementary Note S6: add post-review regression benchmarks (n=100, all 100%)
</commit_message>
<xml_diff>
--- a/docs/supplementary/RCDome_manuscript_V026_supplementary_information.docx
+++ b/docs/supplementary/RCDome_manuscript_V026_supplementary_information.docx
@@ -7622,6 +7622,39 @@
           <w:szCs w:val="24"/>
         </w:rPr>
       </w:pPr>
+    </w:p>
+    <w:p>
+      <w:r>
+        <w:t>Minimal source and insufficient-data directness. For a gene–entity pair with no recorded PMID, the synthesis must state that no PMID is recorded and name the source database; for a pair with an INSUFFICIENT_DATA mechanistic classification, it must say so directly rather than expand empty fields. Across 100 cases of each, the correct behavior was observed in all 100 (100%; 95% CI 96.4–100%).</w:t>
+      </w:r>
+    </w:p>
+    <w:p>
+      <w:r>
+        <w:t>English-only policy. The Board and Q&amp;A answer only in English; a query in any other language must receive the exact refusal sentence. Across 100 non-English queries (Portuguese, Spanish, French), all 100 were refused correctly (100%; 95% CI 96.4–100%).</w:t>
+      </w:r>
+    </w:p>
+    <w:p>
+      <w:r>
+        <w:t>Context fidelity. The Board receives the structured payload (role, direction, mechanistic class, evidence tier, required_for_death) for the queried gene–entity pair, and the prose must not contradict those fields. Across 100 pairs, no contradiction was observed (100%; 95% CI 96.4–100%).</w:t>
+      </w:r>
+    </w:p>
+    <w:p>
+      <w:r>
+        <w:t>Reference discipline. Because a synthesis may cite both gene–RCD association evidence and entity-level definitions, the two citation levels must never be interchanged: a gene–RCD statement must cite the gene-specific association PMID, and a definition statement must cite the entity founding PMID. Across 100 associations, the synthesis separated the two levels correctly in all 100 cases (100%; 95% CI 96.4–100%).</w:t>
+      </w:r>
+    </w:p>
+    <w:p>
+      <w:r>
+        <w:t>The Board and Q&amp;A were benchmarked on random, seed-reproducible samples of n = 100 gene–entity pairs or queries, with the exact binomial 95% confidence interval (Clopper–Pearson).</w:t>
+      </w:r>
+    </w:p>
+    <w:p>
+      <w:r>
+        <w:rPr>
+          <w:b/>
+        </w:rPr>
+        <w:t>Post-review regression benchmarks</w:t>
+      </w:r>
     </w:p>
     <w:p>
       <w:pPr>

</xml_diff>

<commit_message>
Fix S6 regression-benchmark paragraph order (heading first)
</commit_message>
<xml_diff>
--- a/docs/supplementary/RCDome_manuscript_V026_supplementary_information.docx
+++ b/docs/supplementary/RCDome_manuscript_V026_supplementary_information.docx
@@ -247,17 +247,30 @@
         </w:rPr>
         <w:t xml:space="preserve">: Enrique Medina-Acosta: </w:t>
       </w:r>
-      <w:hyperlink r:id="rId8" w:history="1">
-        <w:r>
-          <w:rPr>
-            <w:rStyle w:val="Hyperlink"/>
-            <w:rFonts w:asciiTheme="majorHAnsi" w:hAnsiTheme="majorHAnsi" w:cstheme="majorHAnsi"/>
-            <w:szCs w:val="24"/>
-            <w:lang w:val="pt-BR"/>
-          </w:rPr>
-          <w:t>quique@uenf.br</w:t>
-        </w:r>
-      </w:hyperlink>
+      <w:r>
+        <w:fldChar w:fldCharType="begin"/>
+      </w:r>
+      <w:r>
+        <w:rPr>
+          <w:lang w:val="pt-BR"/>
+        </w:rPr>
+        <w:instrText>HYPERLINK "mailto:quique@uenf.br"</w:instrText>
+      </w:r>
+      <w:r>
+        <w:fldChar w:fldCharType="separate"/>
+      </w:r>
+      <w:r>
+        <w:rPr>
+          <w:rStyle w:val="Hyperlink"/>
+          <w:rFonts w:asciiTheme="majorHAnsi" w:hAnsiTheme="majorHAnsi" w:cstheme="majorHAnsi"/>
+          <w:szCs w:val="24"/>
+          <w:lang w:val="pt-BR"/>
+        </w:rPr>
+        <w:t>quique@uenf.br</w:t>
+      </w:r>
+      <w:r>
+        <w:fldChar w:fldCharType="end"/>
+      </w:r>
     </w:p>
     <w:p>
       <w:pPr>
@@ -314,17 +327,30 @@
         </w:rPr>
         <w:t xml:space="preserve">Emanuell Rodrigues de Souza: </w:t>
       </w:r>
-      <w:hyperlink r:id="rId9" w:history="1">
-        <w:r>
-          <w:rPr>
-            <w:rStyle w:val="Hyperlink"/>
-            <w:rFonts w:asciiTheme="majorHAnsi" w:hAnsiTheme="majorHAnsi" w:cstheme="majorHAnsi"/>
-            <w:szCs w:val="24"/>
-            <w:lang w:val="pt-BR"/>
-          </w:rPr>
-          <w:t>souza.ers00@gmail.com</w:t>
-        </w:r>
-      </w:hyperlink>
+      <w:r>
+        <w:fldChar w:fldCharType="begin"/>
+      </w:r>
+      <w:r>
+        <w:rPr>
+          <w:lang w:val="pt-BR"/>
+        </w:rPr>
+        <w:instrText>HYPERLINK "mailto:souza.ers00@gmail.com"</w:instrText>
+      </w:r>
+      <w:r>
+        <w:fldChar w:fldCharType="separate"/>
+      </w:r>
+      <w:r>
+        <w:rPr>
+          <w:rStyle w:val="Hyperlink"/>
+          <w:rFonts w:asciiTheme="majorHAnsi" w:hAnsiTheme="majorHAnsi" w:cstheme="majorHAnsi"/>
+          <w:szCs w:val="24"/>
+          <w:lang w:val="pt-BR"/>
+        </w:rPr>
+        <w:t>souza.ers00@gmail.com</w:t>
+      </w:r>
+      <w:r>
+        <w:fldChar w:fldCharType="end"/>
+      </w:r>
     </w:p>
     <w:p>
       <w:pPr>
@@ -343,17 +369,30 @@
         </w:rPr>
         <w:t xml:space="preserve">Victor dos Santos Lopes: </w:t>
       </w:r>
-      <w:hyperlink r:id="rId10" w:history="1">
-        <w:r>
-          <w:rPr>
-            <w:rStyle w:val="Hyperlink"/>
-            <w:rFonts w:asciiTheme="majorHAnsi" w:hAnsiTheme="majorHAnsi" w:cstheme="majorHAnsi"/>
-            <w:szCs w:val="24"/>
-            <w:lang w:val="pt-BR"/>
-          </w:rPr>
-          <w:t>victor94santos.lopes@gmail.com</w:t>
-        </w:r>
-      </w:hyperlink>
+      <w:r>
+        <w:fldChar w:fldCharType="begin"/>
+      </w:r>
+      <w:r>
+        <w:rPr>
+          <w:lang w:val="pt-BR"/>
+        </w:rPr>
+        <w:instrText>HYPERLINK "mailto:victor94santos.lopes@gmail.com"</w:instrText>
+      </w:r>
+      <w:r>
+        <w:fldChar w:fldCharType="separate"/>
+      </w:r>
+      <w:r>
+        <w:rPr>
+          <w:rStyle w:val="Hyperlink"/>
+          <w:rFonts w:asciiTheme="majorHAnsi" w:hAnsiTheme="majorHAnsi" w:cstheme="majorHAnsi"/>
+          <w:szCs w:val="24"/>
+          <w:lang w:val="pt-BR"/>
+        </w:rPr>
+        <w:t>victor94santos.lopes@gmail.com</w:t>
+      </w:r>
+      <w:r>
+        <w:fldChar w:fldCharType="end"/>
+      </w:r>
     </w:p>
     <w:p>
       <w:pPr>
@@ -372,17 +411,30 @@
         </w:rPr>
         <w:t xml:space="preserve">Higor Almeida Cordeiro Nogueira: </w:t>
       </w:r>
-      <w:hyperlink r:id="rId11" w:history="1">
-        <w:r>
-          <w:rPr>
-            <w:rStyle w:val="Hyperlink"/>
-            <w:rFonts w:asciiTheme="majorHAnsi" w:hAnsiTheme="majorHAnsi" w:cstheme="majorHAnsi"/>
-            <w:szCs w:val="24"/>
-            <w:lang w:val="pt-BR"/>
-          </w:rPr>
-          <w:t>higoralmeida1995@gmail.com</w:t>
-        </w:r>
-      </w:hyperlink>
+      <w:r>
+        <w:fldChar w:fldCharType="begin"/>
+      </w:r>
+      <w:r>
+        <w:rPr>
+          <w:lang w:val="pt-BR"/>
+        </w:rPr>
+        <w:instrText>HYPERLINK "mailto:higoralmeida1995@gmail.com"</w:instrText>
+      </w:r>
+      <w:r>
+        <w:fldChar w:fldCharType="separate"/>
+      </w:r>
+      <w:r>
+        <w:rPr>
+          <w:rStyle w:val="Hyperlink"/>
+          <w:rFonts w:asciiTheme="majorHAnsi" w:hAnsiTheme="majorHAnsi" w:cstheme="majorHAnsi"/>
+          <w:szCs w:val="24"/>
+          <w:lang w:val="pt-BR"/>
+        </w:rPr>
+        <w:t>higoralmeida1995@gmail.com</w:t>
+      </w:r>
+      <w:r>
+        <w:fldChar w:fldCharType="end"/>
+      </w:r>
     </w:p>
     <w:p>
       <w:pPr>
@@ -399,7 +451,7 @@
         </w:rPr>
         <w:t xml:space="preserve">Enrique Medina-Acosta: </w:t>
       </w:r>
-      <w:hyperlink r:id="rId12" w:history="1">
+      <w:hyperlink r:id="rId8" w:history="1">
         <w:r>
           <w:rPr>
             <w:rStyle w:val="Hyperlink"/>
@@ -428,7 +480,7 @@
           <w:vertAlign w:val="superscript"/>
         </w:rPr>
         <w:sectPr>
-          <w:headerReference w:type="default" r:id="rId13"/>
+          <w:headerReference w:type="default" r:id="rId9"/>
           <w:pgSz w:w="11906" w:h="16838"/>
           <w:pgMar w:top="1417" w:right="1417" w:bottom="1417" w:left="1417" w:header="720" w:footer="720" w:gutter="0"/>
           <w:cols w:space="720"/>
@@ -1510,15 +1562,7 @@
           <w:sz w:val="24"/>
           <w:szCs w:val="24"/>
         </w:rPr>
-        <w:t xml:space="preserve"> </w:t>
-      </w:r>
-      <w:r>
-        <w:rPr>
-          <w:rFonts w:cstheme="majorHAnsi"/>
-          <w:sz w:val="24"/>
-          <w:szCs w:val="24"/>
-        </w:rPr>
-        <w:t>RCDome: Model-Selection Benchmark (CoT + Self-Provided Loop)</w:t>
+        <w:t xml:space="preserve"> RCDome: Model-Selection Benchmark (CoT + Self-Provided Loop)</w:t>
       </w:r>
     </w:p>
     <w:p>
@@ -2872,15 +2916,7 @@
           <w:sz w:val="24"/>
           <w:szCs w:val="24"/>
         </w:rPr>
-        <w:t xml:space="preserve"> </w:t>
-      </w:r>
-      <w:r>
-        <w:rPr>
-          <w:rFonts w:cstheme="majorHAnsi"/>
-          <w:sz w:val="24"/>
-          <w:szCs w:val="24"/>
-        </w:rPr>
-        <w:t xml:space="preserve">RCDome: Consensus API Classification Benchmark: </w:t>
+        <w:t xml:space="preserve"> RCDome: Consensus API Classification Benchmark: </w:t>
       </w:r>
     </w:p>
     <w:p>
@@ -4423,23 +4459,7 @@
           <w:sz w:val="24"/>
           <w:szCs w:val="24"/>
         </w:rPr>
-        <w:t>Supplementary Note S5</w:t>
-      </w:r>
-      <w:r>
-        <w:rPr>
-          <w:rFonts w:cstheme="majorHAnsi"/>
-          <w:sz w:val="24"/>
-          <w:szCs w:val="24"/>
-        </w:rPr>
-        <w:t xml:space="preserve"> - </w:t>
-      </w:r>
-      <w:r>
-        <w:rPr>
-          <w:rFonts w:cstheme="majorHAnsi"/>
-          <w:sz w:val="24"/>
-          <w:szCs w:val="24"/>
-        </w:rPr>
-        <w:t xml:space="preserve">RCDome: AI Usage, Tokens, and Cost: </w:t>
+        <w:t xml:space="preserve">Supplementary Note S5 - RCDome: AI Usage, Tokens, and Cost: </w:t>
       </w:r>
     </w:p>
     <w:p>
@@ -4919,6 +4939,7 @@
                 <w:rFonts w:asciiTheme="majorHAnsi" w:hAnsiTheme="majorHAnsi" w:cstheme="majorHAnsi"/>
                 <w:szCs w:val="24"/>
               </w:rPr>
+              <w:lastRenderedPageBreak/>
               <w:t>Tokens</w:t>
             </w:r>
           </w:p>
@@ -5007,7 +5028,6 @@
           <w:rFonts w:cstheme="majorHAnsi"/>
           <w:szCs w:val="24"/>
         </w:rPr>
-        <w:lastRenderedPageBreak/>
         <w:t>3. Phase 2B: Europe PMC full-text deep RAG</w:t>
       </w:r>
     </w:p>
@@ -6711,6 +6731,7 @@
                 <w:rFonts w:asciiTheme="majorHAnsi" w:hAnsiTheme="majorHAnsi" w:cstheme="majorHAnsi"/>
                 <w:szCs w:val="24"/>
               </w:rPr>
+              <w:lastRenderedPageBreak/>
               <w:t>Phase 2C recovery</w:t>
             </w:r>
           </w:p>
@@ -6805,7 +6826,6 @@
                 <w:rFonts w:asciiTheme="majorHAnsi" w:hAnsiTheme="majorHAnsi" w:cstheme="majorHAnsi"/>
                 <w:szCs w:val="24"/>
               </w:rPr>
-              <w:lastRenderedPageBreak/>
               <w:t>Phase 2E Europe PMC recovery</w:t>
             </w:r>
           </w:p>
@@ -7205,25 +7225,54 @@
           <w:bCs/>
           <w:szCs w:val="24"/>
         </w:rPr>
-        <w:t>Supplementary Note S6</w:t>
-      </w:r>
-      <w:r>
+        <w:t>Supplementary Note S6 - RCDome: Digital Molecular RCD Board Benchmark</w:t>
+      </w:r>
+    </w:p>
+    <w:p>
+      <w:pPr>
+        <w:spacing w:after="0" w:line="240" w:lineRule="auto"/>
+        <w:rPr>
+          <w:rFonts w:asciiTheme="majorHAnsi" w:hAnsiTheme="majorHAnsi" w:cstheme="majorHAnsi"/>
+          <w:szCs w:val="24"/>
+        </w:rPr>
+      </w:pPr>
+      <w:r>
+        <w:rPr>
+          <w:rFonts w:asciiTheme="majorHAnsi" w:hAnsiTheme="majorHAnsi" w:cstheme="majorHAnsi"/>
+          <w:szCs w:val="24"/>
+        </w:rPr>
+        <w:t>This note documents the design and results of the Digital Molecular RCD Board benchmark, which evaluated a prose-synthesis module that answers gene–RCD queries strictly from the RCDome database and the RCDome decoder, with every claim traceable to a matrix row, a decoder field, or a recorded PMID.</w:t>
+      </w:r>
+    </w:p>
+    <w:p>
+      <w:pPr>
+        <w:spacing w:after="0" w:line="240" w:lineRule="auto"/>
         <w:rPr>
           <w:rFonts w:asciiTheme="majorHAnsi" w:hAnsiTheme="majorHAnsi" w:cstheme="majorHAnsi"/>
           <w:b/>
           <w:bCs/>
           <w:szCs w:val="24"/>
         </w:rPr>
-        <w:t xml:space="preserve"> - </w:t>
-      </w:r>
-      <w:r>
+      </w:pPr>
+    </w:p>
+    <w:p>
+      <w:pPr>
+        <w:spacing w:after="0" w:line="240" w:lineRule="auto"/>
         <w:rPr>
           <w:rFonts w:asciiTheme="majorHAnsi" w:hAnsiTheme="majorHAnsi" w:cstheme="majorHAnsi"/>
           <w:b/>
           <w:bCs/>
           <w:szCs w:val="24"/>
         </w:rPr>
-        <w:t>RCDome: Digital Molecular RCD Board Benchmark</w:t>
+      </w:pPr>
+      <w:r>
+        <w:rPr>
+          <w:rFonts w:asciiTheme="majorHAnsi" w:hAnsiTheme="majorHAnsi" w:cstheme="majorHAnsi"/>
+          <w:b/>
+          <w:bCs/>
+          <w:szCs w:val="24"/>
+        </w:rPr>
+        <w:t>Board governance</w:t>
       </w:r>
     </w:p>
     <w:p>
@@ -7239,7 +7288,7 @@
           <w:rFonts w:asciiTheme="majorHAnsi" w:hAnsiTheme="majorHAnsi" w:cstheme="majorHAnsi"/>
           <w:szCs w:val="24"/>
         </w:rPr>
-        <w:t>This note documents the design and results of the Digital Molecular RCD Board benchmark, which evaluated a prose-synthesis module that answers gene–RCD queries strictly from the RCDome database and the RCDome decoder, with every claim traceable to a matrix row, a decoder field, or a recorded PMID.</w:t>
+        <w:t>The board emits a single continuous prose synthesis with no headers, no bullet lists, and no markdown bold. Four provenance categories govern how each sentence is written without being printed as labels: facts with a PMID ("the RCDome database records … (PMID …)"), model annotation ("within the RCDome database …"), decoder context ("the RCDome decoder defines/states …"), and hypothesis ("Hypothesis:" or "may suggest" or "is consistent with"). Seven rules are enforced in the prompt and by a deterministic post-generation scrub, never by a second model: (1) only "RCDome database" and "RCDome decoder" are used, with the bare words "database", "decoder", and the internal term "matrix" banned (the matrix rule is biology-safe, ignoring extracellular matrix, mitochondrial matrix, and matrix metalloproteinase); (2) assertive causal verbs are replaced with hedging equivalents in all tenses; (3) genuine uncertainty phrasing is preserved; (4) the exact verbatim disclaimer is appended at the very end; (5) the synthesis body ends with exactly three numbered "Suggested Queries:" immediately before the disclaimer (auto-numbered, never invented); (6) only PMIDs present in the data may be cited, and the founding PMID is always cited when the entity's operational definition is described; and (7) a pair absent from the database is reported as "not recorded" without inventing a role or direction.</w:t>
       </w:r>
     </w:p>
     <w:p>
@@ -7247,6 +7296,49 @@
         <w:spacing w:after="0" w:line="240" w:lineRule="auto"/>
         <w:rPr>
           <w:rFonts w:asciiTheme="majorHAnsi" w:hAnsiTheme="majorHAnsi" w:cstheme="majorHAnsi"/>
+          <w:szCs w:val="24"/>
+        </w:rPr>
+      </w:pPr>
+    </w:p>
+    <w:p>
+      <w:pPr>
+        <w:spacing w:after="0" w:line="240" w:lineRule="auto"/>
+        <w:rPr>
+          <w:rFonts w:asciiTheme="majorHAnsi" w:hAnsiTheme="majorHAnsi" w:cstheme="majorHAnsi"/>
+          <w:szCs w:val="24"/>
+        </w:rPr>
+      </w:pPr>
+      <w:r>
+        <w:rPr>
+          <w:rFonts w:asciiTheme="majorHAnsi" w:hAnsiTheme="majorHAnsi" w:cstheme="majorHAnsi"/>
+          <w:b/>
+          <w:szCs w:val="24"/>
+        </w:rPr>
+        <w:t>Q&amp;A retrieval strategy</w:t>
+      </w:r>
+    </w:p>
+    <w:p>
+      <w:pPr>
+        <w:spacing w:after="0" w:line="240" w:lineRule="auto"/>
+        <w:rPr>
+          <w:rFonts w:asciiTheme="majorHAnsi" w:hAnsiTheme="majorHAnsi" w:cstheme="majorHAnsi"/>
+          <w:szCs w:val="24"/>
+        </w:rPr>
+      </w:pPr>
+      <w:r>
+        <w:rPr>
+          <w:rFonts w:asciiTheme="majorHAnsi" w:hAnsiTheme="majorHAnsi" w:cstheme="majorHAnsi"/>
+          <w:szCs w:val="24"/>
+        </w:rPr>
+        <w:lastRenderedPageBreak/>
+        <w:t>The Q&amp;A submodule answers free-form questions across all 53 entities and all 9,265 genes. The complete gene–form matrix (22,473 rows, each carrying mechanistic class, role, direction, evidence tier, and PMID) exceeds the model context, so the Q&amp;A uses a retrieval-augmented strategy that never deletes data. A static layer always injects the complete gene–entity index (all 22,473 associations, names only) and the full 53-entity decoder. A dynamic layer then detects, for each question, the entities mentioned (by normalized name or its stem, so “apoptotic” matches Apoptosis) and any gene symbols, and injects the full four-dimension records for exactly those rows. Genes named explicitly in the question are always placed first so the budget can never displace them. The dynamic layer is capped so the full prompt stays within the model context (about 58K tokens), with a reply token limit applied. No entity or gene is ever excluded from the index, and every classification (MECHANISTIC, LITERATURE_GAP, CONTEXT_GAP, CO_OCCURRENCE, DATABASE_ONLY, INSUFFICIENT_DATA) remains retrievable, so a gene recorded as executor in one form and regulator in another is shown with both records.</w:t>
+      </w:r>
+    </w:p>
+    <w:p>
+      <w:pPr>
+        <w:spacing w:after="0" w:line="240" w:lineRule="auto"/>
+        <w:rPr>
+          <w:rFonts w:asciiTheme="majorHAnsi" w:hAnsiTheme="majorHAnsi" w:cstheme="majorHAnsi"/>
           <w:b/>
           <w:bCs/>
           <w:szCs w:val="24"/>
@@ -7270,7 +7362,7 @@
           <w:bCs/>
           <w:szCs w:val="24"/>
         </w:rPr>
-        <w:t>Board governance</w:t>
+        <w:t>Benchmark design</w:t>
       </w:r>
     </w:p>
     <w:p>
@@ -7286,7 +7378,7 @@
           <w:rFonts w:asciiTheme="majorHAnsi" w:hAnsiTheme="majorHAnsi" w:cstheme="majorHAnsi"/>
           <w:szCs w:val="24"/>
         </w:rPr>
-        <w:t>The board emits a single continuous prose synthesis with no headers, no bullet lists, and no markdown bold. Four provenance categories govern how each sentence is written without being printed as labels: facts with a PMID ("the RCDome database records … (PMID …)"), model annotation ("within the RCDome database …"), decoder context ("the RCDome decoder defines/states …"), and hypothesis ("Hypothesis:" or "may suggest" or "is consistent with"). Seven rules are enforced in the prompt and by a deterministic post-generation scrub, never by a second model: (1) only "RCDome database" and "RCDome decoder" are used, with the bare words "database", "decoder", and the internal term "matrix" banned (the matrix rule is biology-safe, ignoring extracellular matrix, mitochondrial matrix, and matrix metalloproteinase); (2) assertive causal verbs are replaced with hedging equivalents in all tenses; (3) genuine uncertainty phrasing is preserved; (4) the exact verbatim disclaimer is appended at the very end; (5) the synthesis body ends with exactly three numbered "Suggested Queries:" immediately before the disclaimer (auto-numbered, never invented); (6) only PMIDs present in the data may be cited, and the founding PMID is always cited when the entity's operational definition is described; and (7) a pair absent from the database is reported as "not recorded" without inventing a role or direction.</w:t>
+        <w:t>The benchmark (run_board_benchmark.py and audit_canonical.py) evaluates the board on nine tests, each with its own statistically determined sample size, 95% Wilson confidence interval, and significance test. The deterministic scrub is applied to the raw model output before the audit, so the audit measures the final, scrubbed text; scrub corrections are logged separately. The audit is a fixed 28-point checklist per synthesis report: 10 governance checks (causal verbs, hedging, disclaimer, three queries), 14 policy checks (terminology and relationship terms), and 4 accuracy checks (cited PMIDs exist, founding PMID cited, role matches, direction matches). Census reports use a 24-point lookup audit without the query requirement, and negative controls use a 29-point audit with inverted role and direction checks. Sample sizes follow the standard formulas: n = z²·p·(1−p)/E² for a proportion at 95% confidence (z = 1.96); n = (zα+zβ)²·2·p̄·(1−p̄)/Δ² to detect a difference at 80% power (zβ = 0.84); and the Wilson 95% interval (p + z²/2n ± z·√(p(1−p)/n + z²/4n²))/(1 + z²/n).</w:t>
       </w:r>
     </w:p>
     <w:p>
@@ -7294,6 +7386,8 @@
         <w:spacing w:after="0" w:line="240" w:lineRule="auto"/>
         <w:rPr>
           <w:rFonts w:asciiTheme="majorHAnsi" w:hAnsiTheme="majorHAnsi" w:cstheme="majorHAnsi"/>
+          <w:b/>
+          <w:bCs/>
           <w:szCs w:val="24"/>
         </w:rPr>
       </w:pPr>
@@ -7303,16 +7397,19 @@
         <w:spacing w:after="0" w:line="240" w:lineRule="auto"/>
         <w:rPr>
           <w:rFonts w:asciiTheme="majorHAnsi" w:hAnsiTheme="majorHAnsi" w:cstheme="majorHAnsi"/>
-          <w:szCs w:val="24"/>
-        </w:rPr>
-      </w:pPr>
-      <w:r>
-        <w:rPr>
-          <w:rFonts w:asciiTheme="majorHAnsi" w:hAnsiTheme="majorHAnsi" w:cstheme="majorHAnsi"/>
           <w:b/>
-          <w:szCs w:val="24"/>
-        </w:rPr>
-        <w:t>Q&amp;A retrieval strategy</w:t>
+          <w:bCs/>
+          <w:szCs w:val="24"/>
+        </w:rPr>
+      </w:pPr>
+      <w:r>
+        <w:rPr>
+          <w:rFonts w:asciiTheme="majorHAnsi" w:hAnsiTheme="majorHAnsi" w:cstheme="majorHAnsi"/>
+          <w:b/>
+          <w:bCs/>
+          <w:szCs w:val="24"/>
+        </w:rPr>
+        <w:t>Results</w:t>
       </w:r>
     </w:p>
     <w:p>
@@ -7328,7 +7425,7 @@
           <w:rFonts w:asciiTheme="majorHAnsi" w:hAnsiTheme="majorHAnsi" w:cstheme="majorHAnsi"/>
           <w:szCs w:val="24"/>
         </w:rPr>
-        <w:t xml:space="preserve">The Q&amp;A submodule answers free-form questions across all 53 entities and all 9,265 genes. The complete gene–form matrix (22,473 rows, each carrying mechanistic class, role, direction, evidence tier, and PMID) exceeds the model context, so the </w:t>
+        <w:t xml:space="preserve">The benchmark ran on 2026-09-09 with seed 42, temperature 0.7, prompt v2-smoke-aligned, and the deepseek-chat model. Golden accuracy was 26/26 (100%; Wilson 95% CI 87.1–100%; binomial against 0.95, p = 0.639). Census accuracy was 53/53 (100%; CI 93.2–100%; binomial p = 0.114). Fact-stability on BAX-Apoptosis was 73/73 (100% per fact for gene, entity, and founding PMID; CI 95.0–100%). Governance showed 1 violation across 2,142 checks (0.047%; CI 0.008–0.264%), broken down as causality 0, hedge 0, disclaimer 0, queries 1, terminology 0, and accuracy 0. Anti-hallucination caught 4 of 4 traps (100%; CI 51.0–100%). Articulation conformed in 78 of 79 reports (98.7%; CI 93.2–99.8%). Model comparison favored deepseek-chat (26/26, 100%) over deepseek-reasoner (22/26, 84.6%). Chat governance passed 10/10 (100% across five question types). The single governance violation was MLKL-Necroptosis failing the exactly-three-queries check; on direct regeneration that same report passed 30/30, confirming this is temperature-driven prose variability rather than a systematic defect. The deterministic scrub applied 163 corrections across the </w:t>
       </w:r>
       <w:r>
         <w:rPr>
@@ -7336,7 +7433,7 @@
           <w:szCs w:val="24"/>
         </w:rPr>
         <w:lastRenderedPageBreak/>
-        <w:t>Q&amp;A uses a retrieval-augmented strategy that never deletes data. A static layer always injects the complete gene–entity index (all 22,473 associations, names only) and the full 53-entity decoder. A dynamic layer then detects, for each question, the entities mentioned (by normalized name or its stem, so “apoptotic” matches Apoptosis) and any gene symbols, and injects the full four-dimension records for exactly those rows. Genes named explicitly in the question are always placed first so the budget can never displace them. The dynamic layer is capped so the full prompt stays within the model context (about 58K tokens), with a reply token limit applied. No entity or gene is ever excluded from the index, and every classification (MECHANISTIC, LITERATURE_GAP, CONTEXT_GAP, CO_OCCURRENCE, DATABASE_ONLY, INSUFFICIENT_DATA) remains retrievable, so a gene recorded as executor in one form and regulator in another is shown with both records.</w:t>
+        <w:t>run (55 bare database or decoder terms, causal-verb hedging, markdown-bold removal, and disclaimer and query normalization).</w:t>
       </w:r>
     </w:p>
     <w:p>
@@ -7345,7 +7442,6 @@
         <w:rPr>
           <w:rFonts w:asciiTheme="majorHAnsi" w:hAnsiTheme="majorHAnsi" w:cstheme="majorHAnsi"/>
           <w:b/>
-          <w:bCs/>
           <w:szCs w:val="24"/>
         </w:rPr>
       </w:pPr>
@@ -7355,35 +7451,145 @@
         <w:spacing w:after="0" w:line="240" w:lineRule="auto"/>
         <w:rPr>
           <w:rFonts w:asciiTheme="majorHAnsi" w:hAnsiTheme="majorHAnsi" w:cstheme="majorHAnsi"/>
+          <w:szCs w:val="24"/>
+        </w:rPr>
+      </w:pPr>
+      <w:r>
+        <w:rPr>
+          <w:rFonts w:asciiTheme="majorHAnsi" w:hAnsiTheme="majorHAnsi" w:cstheme="majorHAnsi"/>
+          <w:b/>
+          <w:szCs w:val="24"/>
+        </w:rPr>
+        <w:t>Q&amp;A benchmark description and validation</w:t>
+      </w:r>
+    </w:p>
+    <w:p>
+      <w:pPr>
+        <w:spacing w:after="0" w:line="240" w:lineRule="auto"/>
+        <w:rPr>
+          <w:rFonts w:asciiTheme="majorHAnsi" w:hAnsiTheme="majorHAnsi" w:cstheme="majorHAnsi"/>
+          <w:szCs w:val="24"/>
+        </w:rPr>
+      </w:pPr>
+      <w:r>
+        <w:rPr>
+          <w:rFonts w:asciiTheme="majorHAnsi" w:hAnsiTheme="majorHAnsi" w:cstheme="majorHAnsi"/>
+          <w:szCs w:val="24"/>
+        </w:rPr>
+        <w:t xml:space="preserve">The Q&amp;A submodule was benchmarked with the same statistical machinery as the board benchmark (point estimate, Wilson 95% CI, binomial test against a 0.95 null), using deepseek-chat, temperature 0.3, a 1500-token reply cap, and the full retrieval-augmented prompt. Two tests were run. T10 positive accuracy (n = 100; 25 golden executor or regulator gene–form pairs, each queried on role, direction, evidence tier, and supporting PMID) audited five checks per answer: the correct fact is cited, the RCDome source is named, the interpretation is hedged, the disclaimer is appended, and no PMID absent from the data is cited; the result was 100/100 = 100% (Wilson 95% CI 96.3–100%, binomial p = 0.010). T11 negative controls (n = 100; 8 not-recorded pairs queried on the same four types, plus 68 out-of-scope or fabrication queries) were all reported as absent or refused without a hallucinated PMID; the result was 100/100 = 100% (Wilson 95% CI 96.3–100%, binomial p = 0.010). The significance of the Q&amp;A submodule is that it makes the board a full-coverage interface rather than a single-entity viewer: the static layer keeps the complete gene–entity index and the dynamic layer </w:t>
+      </w:r>
+      <w:proofErr w:type="gramStart"/>
+      <w:r>
+        <w:rPr>
+          <w:rFonts w:asciiTheme="majorHAnsi" w:hAnsiTheme="majorHAnsi" w:cstheme="majorHAnsi"/>
+          <w:szCs w:val="24"/>
+        </w:rPr>
+        <w:t>retrieves</w:t>
+      </w:r>
+      <w:proofErr w:type="gramEnd"/>
+      <w:r>
+        <w:rPr>
+          <w:rFonts w:asciiTheme="majorHAnsi" w:hAnsiTheme="majorHAnsi" w:cstheme="majorHAnsi"/>
+          <w:szCs w:val="24"/>
+        </w:rPr>
+        <w:t xml:space="preserve"> the full four-dimension records on demand, so the Q&amp;A answers across all 53 entities and all 9,265 genes without funneling the data. Every classification (MECHANISTIC, LITERATURE_GAP, CONTEXT_GAP, CO_OCCURRENCE, DATABASE_ONLY, INSUFFICIENT_DATA) remains reachable, and a gene recorded as an executor in one form and a regulator in another is shown with both records (for example, BAX as a mechanistic executor in apoptosis with PMID 17235284, together with its co-occurrence annotations in necroptosis and pyroptosis and its insufficient-data annotations in autosis, erebosis, and oncosis). The 100% positive and negative results recorded zero hallucinated PMIDs across the benchmark, demonstrating that full coverage and zero observed hallucination were achieved together in the same module.</w:t>
+      </w:r>
+    </w:p>
+    <w:p>
+      <w:pPr>
+        <w:spacing w:after="0" w:line="240" w:lineRule="auto"/>
+        <w:rPr>
+          <w:rFonts w:asciiTheme="majorHAnsi" w:hAnsiTheme="majorHAnsi" w:cstheme="majorHAnsi"/>
+          <w:szCs w:val="24"/>
+        </w:rPr>
+      </w:pPr>
+    </w:p>
+    <w:p>
+      <w:pPr>
+        <w:spacing w:after="0" w:line="240" w:lineRule="auto"/>
+        <w:rPr>
+          <w:rFonts w:asciiTheme="majorHAnsi" w:hAnsiTheme="majorHAnsi" w:cstheme="majorHAnsi"/>
+          <w:szCs w:val="24"/>
+        </w:rPr>
+      </w:pPr>
+      <w:r>
+        <w:rPr>
+          <w:rFonts w:asciiTheme="majorHAnsi" w:hAnsiTheme="majorHAnsi" w:cstheme="majorHAnsi"/>
           <w:b/>
           <w:bCs/>
           <w:szCs w:val="24"/>
         </w:rPr>
-      </w:pPr>
-      <w:r>
+        <w:t>Statistical design.</w:t>
+      </w:r>
+      <w:r>
+        <w:rPr>
+          <w:rFonts w:asciiTheme="majorHAnsi" w:hAnsiTheme="majorHAnsi" w:cstheme="majorHAnsi"/>
+          <w:szCs w:val="24"/>
+        </w:rPr>
+        <w:t xml:space="preserve"> The Q&amp;A tests use the same sample-size formulas as the board benchmark: proportion 95% CI n = z²·p·(1−p)/E² (z = 1.96); detect a defect Δ with 80% power n = (zα+z</w:t>
+      </w:r>
+      <w:proofErr w:type="gramStart"/>
+      <w:r>
+        <w:rPr>
+          <w:rFonts w:asciiTheme="majorHAnsi" w:hAnsiTheme="majorHAnsi" w:cstheme="majorHAnsi"/>
+          <w:szCs w:val="24"/>
+        </w:rPr>
+        <w:t>β)²</w:t>
+      </w:r>
+      <w:proofErr w:type="gramEnd"/>
+      <w:r>
+        <w:rPr>
+          <w:rFonts w:asciiTheme="majorHAnsi" w:hAnsiTheme="majorHAnsi" w:cstheme="majorHAnsi"/>
+          <w:szCs w:val="24"/>
+        </w:rPr>
+        <w:t>·2·p̄·(1−p̄)/Δ² (zβ = 0.84); Wilson 95% CI lower bound for 100% observed n</w:t>
+      </w:r>
+      <w:proofErr w:type="gramStart"/>
+      <w:r>
+        <w:rPr>
+          <w:rFonts w:asciiTheme="majorHAnsi" w:hAnsiTheme="majorHAnsi" w:cstheme="majorHAnsi"/>
+          <w:szCs w:val="24"/>
+        </w:rPr>
+        <w:t>/(</w:t>
+      </w:r>
+      <w:proofErr w:type="gramEnd"/>
+      <w:r>
+        <w:rPr>
+          <w:rFonts w:asciiTheme="majorHAnsi" w:hAnsiTheme="majorHAnsi" w:cstheme="majorHAnsi"/>
+          <w:szCs w:val="24"/>
+        </w:rPr>
+        <w:t>n + z²). A claim of accuracy at least 95% with 95% confidence requires the Wilson lower bound to reach 95%, which occurs at n = 73 (73/76.84 = 0.950). For two-sided significance against the 0.95 null, n = 100 gives p = 0.010. In power terms (80%): n = 77 detects a 15% absolute defect (p = 0.80), n = 142 detects 10%, and n = 436 detects 5%. The chosen n = 100 therefore detects an absolute defect of about 12.5% at 80% power, holds the Wilson lower bound at 96.3%, and gives a one-sided binomial p = 0.006 and a two-sided p = 0.010. T10 breakdown (25 pairs × 4 question types, all 100 passed): role 25/25, direction 25/25, evidence tier 25/25, supporting PMID 25/25. T11 breakdown: not-recorded 32/32 (8 pairs × 4 types), out-of-scope and fabrication refusal 68/68. Audit volume: T10 = 100 answers × 5 checks = 500; T11 = 32 not-recorded checks plus 68 refusal checks × 2 = 168; 668 checks in total, all passed.</w:t>
+      </w:r>
+    </w:p>
+    <w:p>
+      <w:pPr>
+        <w:spacing w:after="0" w:line="240" w:lineRule="auto"/>
         <w:rPr>
           <w:rFonts w:asciiTheme="majorHAnsi" w:hAnsiTheme="majorHAnsi" w:cstheme="majorHAnsi"/>
           <w:b/>
           <w:bCs/>
           <w:szCs w:val="24"/>
         </w:rPr>
-        <w:t>Benchmark design</w:t>
-      </w:r>
+      </w:pPr>
     </w:p>
     <w:p>
       <w:pPr>
         <w:spacing w:after="0" w:line="240" w:lineRule="auto"/>
         <w:rPr>
           <w:rFonts w:asciiTheme="majorHAnsi" w:hAnsiTheme="majorHAnsi" w:cstheme="majorHAnsi"/>
-          <w:szCs w:val="24"/>
-        </w:rPr>
-      </w:pPr>
-      <w:r>
-        <w:rPr>
-          <w:rFonts w:asciiTheme="majorHAnsi" w:hAnsiTheme="majorHAnsi" w:cstheme="majorHAnsi"/>
-          <w:szCs w:val="24"/>
-        </w:rPr>
-        <w:t>The benchmark (run_board_benchmark.py and audit_canonical.py) evaluates the board on nine tests, each with its own statistically determined sample size, 95% Wilson confidence interval, and significance test. The deterministic scrub is applied to the raw model output before the audit, so the audit measures the final, scrubbed text; scrub corrections are logged separately. The audit is a fixed 28-point checklist per synthesis report: 10 governance checks (causal verbs, hedging, disclaimer, three queries), 14 policy checks (terminology and relationship terms), and 4 accuracy checks (cited PMIDs exist, founding PMID cited, role matches, direction matches). Census reports use a 24-point lookup audit without the query requirement, and negative controls use a 29-point audit with inverted role and direction checks. Sample sizes follow the standard formulas: n = z²·p·(1−p)/E² for a proportion at 95% confidence (z = 1.96); n = (zα+zβ)²·2·p̄·(1−p̄)/Δ² to detect a difference at 80% power (zβ = 0.84); and the Wilson 95% interval (p + z²/2n ± z·√(p(1−p)/n + z²/4n²))/(1 + z²/n).</w:t>
+          <w:b/>
+          <w:bCs/>
+          <w:szCs w:val="24"/>
+        </w:rPr>
+      </w:pPr>
+      <w:r>
+        <w:rPr>
+          <w:rFonts w:asciiTheme="majorHAnsi" w:hAnsiTheme="majorHAnsi" w:cstheme="majorHAnsi"/>
+          <w:b/>
+          <w:bCs/>
+          <w:szCs w:val="24"/>
+        </w:rPr>
+        <w:t>Code corrections</w:t>
       </w:r>
     </w:p>
     <w:p>
@@ -7391,172 +7597,58 @@
         <w:spacing w:after="0" w:line="240" w:lineRule="auto"/>
         <w:rPr>
           <w:rFonts w:asciiTheme="majorHAnsi" w:hAnsiTheme="majorHAnsi" w:cstheme="majorHAnsi"/>
-          <w:b/>
-          <w:bCs/>
-          <w:szCs w:val="24"/>
-        </w:rPr>
-      </w:pPr>
+          <w:szCs w:val="24"/>
+        </w:rPr>
+      </w:pPr>
+      <w:r>
+        <w:rPr>
+          <w:rFonts w:asciiTheme="majorHAnsi" w:hAnsiTheme="majorHAnsi" w:cstheme="majorHAnsi"/>
+          <w:szCs w:val="24"/>
+        </w:rPr>
+        <w:lastRenderedPageBreak/>
+        <w:t>Six defects were found and fixed during validation: (1) the violation-type mapping had mislabeled the hedging and query checks and contained a dead branch, so hedge and query counts were reported incorrectly; (2) every failed check is now logged with its pair, check identifier, name, and exact detail rather than only tallies; (3) the scrub now removes markdown bold markers; (4) entities with the sentinel category CORE_PENDING are no longer falsely flagged, which corrected census accuracy from 51/53 to 53/53; (5) the query-count articulation check now applies only to synthesis and negative reports, not to census lookups; and (6) the matrix policy check now ignores extracellular matrix, mitochondrial matrix, and matrix metalloproteinase.</w:t>
+      </w:r>
     </w:p>
     <w:p>
       <w:pPr>
         <w:spacing w:after="0" w:line="240" w:lineRule="auto"/>
         <w:rPr>
           <w:rFonts w:asciiTheme="majorHAnsi" w:hAnsiTheme="majorHAnsi" w:cstheme="majorHAnsi"/>
-          <w:b/>
-          <w:bCs/>
-          <w:szCs w:val="24"/>
-        </w:rPr>
-      </w:pPr>
-      <w:r>
-        <w:rPr>
-          <w:rFonts w:asciiTheme="majorHAnsi" w:hAnsiTheme="majorHAnsi" w:cstheme="majorHAnsi"/>
-          <w:b/>
-          <w:bCs/>
-          <w:szCs w:val="24"/>
-        </w:rPr>
-        <w:t>Results</w:t>
-      </w:r>
+          <w:szCs w:val="24"/>
+        </w:rPr>
+      </w:pPr>
     </w:p>
     <w:p>
-      <w:pPr>
-        <w:spacing w:after="0" w:line="240" w:lineRule="auto"/>
-        <w:rPr>
-          <w:rFonts w:asciiTheme="majorHAnsi" w:hAnsiTheme="majorHAnsi" w:cstheme="majorHAnsi"/>
-          <w:szCs w:val="24"/>
-        </w:rPr>
-      </w:pPr>
-      <w:r>
-        <w:rPr>
-          <w:rFonts w:asciiTheme="majorHAnsi" w:hAnsiTheme="majorHAnsi" w:cstheme="majorHAnsi"/>
-          <w:szCs w:val="24"/>
-        </w:rPr>
-        <w:t>The benchmark ran on 2026-09-09 with seed 42, temperature 0.7, prompt v2-smoke-aligned, and the deepseek-chat model. Golden accuracy was 26/26 (100%; Wilson 95% CI 87.1–100%; binomial against 0.95, p = 0.639). Census accuracy was 53/53 (100%; CI 93.2–100%; binomial p = 0.114). Fact-stability on BAX-Apoptosis was 73/73 (100% per fact for gene, entity, and founding PMID; CI 95.0–100%). Governance showed 1 violation across 2,142 checks (0.047%; CI 0.008–0.264%), broken down as causality 0, hedge 0, disclaimer 0, queries 1, terminology 0, and accuracy 0. Anti-hallucination caught 4 of 4 traps (100%; CI 51.0–100%). Articulation conformed in 78 of 79 reports (98.7%; CI 93.2–99.8%). Model comparison favored deepseek-chat (26/26, 100%) over deepseek-reasoner (22/26, 84.6%). Chat governance passed 10/10 (100% across five question types). The single governance violation was MLKL-Necroptosis failing the exactly-three-queries check; on direct regeneration that same report passed 30/30, confirming this is temperature-driven prose variability rather than a systematic defect. The deterministic scrub applied 163 corrections across the run (55 bare database or decoder terms, causal-verb hedging, markdown-bold removal, and disclaimer and query normalization).</w:t>
+      <w:r>
+        <w:rPr>
+          <w:b/>
+        </w:rPr>
+        <w:t>Post-review regression benchmarks</w:t>
       </w:r>
     </w:p>
     <w:p>
-      <w:pPr>
-        <w:spacing w:after="0" w:line="240" w:lineRule="auto"/>
-        <w:rPr>
-          <w:rFonts w:asciiTheme="majorHAnsi" w:hAnsiTheme="majorHAnsi" w:cstheme="majorHAnsi"/>
-          <w:b/>
-          <w:szCs w:val="24"/>
-        </w:rPr>
-      </w:pPr>
+      <w:r>
+        <w:t>The Board and Q&amp;A were benchmarked on random, seed-reproducible samples of n = 100 gene–entity pairs or queries, with the exact binomial 95% confidence interval (Clopper–Pearson).</w:t>
+      </w:r>
     </w:p>
     <w:p>
-      <w:pPr>
-        <w:spacing w:after="0" w:line="240" w:lineRule="auto"/>
-        <w:rPr>
-          <w:rFonts w:asciiTheme="majorHAnsi" w:hAnsiTheme="majorHAnsi" w:cstheme="majorHAnsi"/>
-          <w:szCs w:val="24"/>
-        </w:rPr>
-      </w:pPr>
-      <w:r>
-        <w:rPr>
-          <w:rFonts w:asciiTheme="majorHAnsi" w:hAnsiTheme="majorHAnsi" w:cstheme="majorHAnsi"/>
-          <w:b/>
-          <w:szCs w:val="24"/>
-        </w:rPr>
-        <w:lastRenderedPageBreak/>
-        <w:t>Q&amp;A benchmark description and validation</w:t>
+      <w:r>
+        <w:t>Reference discipline. Because a synthesis may cite both gene–RCD association evidence and entity-level definitions, the two citation levels must never be interchanged: a gene–RCD statement must cite the gene-specific association PMID, and a definition statement must cite the entity founding PMID. Across 100 associations, the synthesis separated the two levels correctly in all 100 cases (100%; 95% CI 96.4–100%).</w:t>
       </w:r>
     </w:p>
     <w:p>
-      <w:pPr>
-        <w:spacing w:after="0" w:line="240" w:lineRule="auto"/>
-        <w:rPr>
-          <w:rFonts w:asciiTheme="majorHAnsi" w:hAnsiTheme="majorHAnsi" w:cstheme="majorHAnsi"/>
-          <w:szCs w:val="24"/>
-        </w:rPr>
-      </w:pPr>
-      <w:r>
-        <w:rPr>
-          <w:rFonts w:asciiTheme="majorHAnsi" w:hAnsiTheme="majorHAnsi" w:cstheme="majorHAnsi"/>
-          <w:szCs w:val="24"/>
-        </w:rPr>
-        <w:t xml:space="preserve">The Q&amp;A submodule was benchmarked with the same statistical machinery as the board benchmark (point estimate, Wilson 95% CI, binomial test against a 0.95 null), using deepseek-chat, temperature 0.3, a 1500-token reply cap, and the full retrieval-augmented prompt. Two tests were run. T10 positive accuracy (n = 100; 25 golden executor or regulator gene–form pairs, each queried on role, direction, evidence tier, and supporting PMID) audited five checks per answer: the correct fact is cited, the RCDome source is named, the interpretation is hedged, the disclaimer is appended, and no PMID absent from the data is cited; the result was 100/100 = 100% (Wilson 95% CI 96.3–100%, binomial p = 0.010). T11 negative controls (n = 100; 8 not-recorded pairs queried on the same four types, plus 68 out-of-scope or fabrication queries) were all reported as absent or refused without a hallucinated PMID; the result was 100/100 = 100% (Wilson 95% CI 96.3–100%, binomial p = 0.010). The significance of the Q&amp;A submodule is that it makes the board a full-coverage interface rather than a single-entity viewer: the static layer keeps the complete gene–entity index and the dynamic layer </w:t>
-      </w:r>
-      <w:proofErr w:type="gramStart"/>
-      <w:r>
-        <w:rPr>
-          <w:rFonts w:asciiTheme="majorHAnsi" w:hAnsiTheme="majorHAnsi" w:cstheme="majorHAnsi"/>
-          <w:szCs w:val="24"/>
-        </w:rPr>
-        <w:t>retrieves</w:t>
-      </w:r>
-      <w:proofErr w:type="gramEnd"/>
-      <w:r>
-        <w:rPr>
-          <w:rFonts w:asciiTheme="majorHAnsi" w:hAnsiTheme="majorHAnsi" w:cstheme="majorHAnsi"/>
-          <w:szCs w:val="24"/>
-        </w:rPr>
-        <w:t xml:space="preserve"> the full four-dimension records on demand, so the Q&amp;A answers across all 53 entities and all 9,265 genes without funneling the data. Every classification (MECHANISTIC, LITERATURE_GAP, CONTEXT_GAP, CO_OCCURRENCE, DATABASE_ONLY, INSUFFICIENT_DATA) remains reachable, and a gene recorded as an executor in one form and a regulator in another is shown with both records (for example, BAX as a mechanistic executor in apoptosis with PMID 17235284, together with its co-occurrence annotations in necroptosis and pyroptosis and its insufficient-data annotations in autosis, erebosis, and oncosis). The 100% positive and negative results recorded zero hallucinated PMIDs across the benchmark, demonstrating that full coverage and zero observed hallucination were achieved together in the same module.</w:t>
+      <w:r>
+        <w:t>Context fidelity. The Board receives the structured payload (role, direction, mechanistic class, evidence tier, required_for_death) for the queried gene–entity pair, and the prose must not contradict those fields. Across 100 pairs, no contradiction was observed (100%; 95% CI 96.4–100%).</w:t>
       </w:r>
     </w:p>
     <w:p>
-      <w:pPr>
-        <w:spacing w:after="0" w:line="240" w:lineRule="auto"/>
-        <w:rPr>
-          <w:rFonts w:asciiTheme="majorHAnsi" w:hAnsiTheme="majorHAnsi" w:cstheme="majorHAnsi"/>
-          <w:szCs w:val="24"/>
-        </w:rPr>
-      </w:pPr>
+      <w:r>
+        <w:t>English-only policy. The Board and Q&amp;A answer only in English; a query in any other language must receive the exact refusal sentence. Across 100 non-English queries (Portuguese, Spanish, French), all 100 were refused correctly (100%; 95% CI 96.4–100%).</w:t>
+      </w:r>
     </w:p>
     <w:p>
-      <w:pPr>
-        <w:spacing w:after="0" w:line="240" w:lineRule="auto"/>
-        <w:rPr>
-          <w:rFonts w:asciiTheme="majorHAnsi" w:hAnsiTheme="majorHAnsi" w:cstheme="majorHAnsi"/>
-          <w:szCs w:val="24"/>
-        </w:rPr>
-      </w:pPr>
-      <w:r>
-        <w:rPr>
-          <w:rFonts w:asciiTheme="majorHAnsi" w:hAnsiTheme="majorHAnsi" w:cstheme="majorHAnsi"/>
-          <w:b/>
-          <w:bCs/>
-          <w:szCs w:val="24"/>
-        </w:rPr>
-        <w:t>Statistical design.</w:t>
-      </w:r>
-      <w:r>
-        <w:rPr>
-          <w:rFonts w:asciiTheme="majorHAnsi" w:hAnsiTheme="majorHAnsi" w:cstheme="majorHAnsi"/>
-          <w:szCs w:val="24"/>
-        </w:rPr>
-        <w:t xml:space="preserve"> The Q&amp;A tests use the same sample-size formulas as the board benchmark: proportion 95% CI n = z²·p·(1−p)/E² (z = 1.96); detect a defect Δ with 80% power n = (zα+z</w:t>
-      </w:r>
-      <w:proofErr w:type="gramStart"/>
-      <w:r>
-        <w:rPr>
-          <w:rFonts w:asciiTheme="majorHAnsi" w:hAnsiTheme="majorHAnsi" w:cstheme="majorHAnsi"/>
-          <w:szCs w:val="24"/>
-        </w:rPr>
-        <w:t>β)²</w:t>
-      </w:r>
-      <w:proofErr w:type="gramEnd"/>
-      <w:r>
-        <w:rPr>
-          <w:rFonts w:asciiTheme="majorHAnsi" w:hAnsiTheme="majorHAnsi" w:cstheme="majorHAnsi"/>
-          <w:szCs w:val="24"/>
-        </w:rPr>
-        <w:t>·2·p̄·(1−p̄)/Δ² (zβ = 0.84); Wilson 95% CI lower bound for 100% observed n</w:t>
-      </w:r>
-      <w:proofErr w:type="gramStart"/>
-      <w:r>
-        <w:rPr>
-          <w:rFonts w:asciiTheme="majorHAnsi" w:hAnsiTheme="majorHAnsi" w:cstheme="majorHAnsi"/>
-          <w:szCs w:val="24"/>
-        </w:rPr>
-        <w:t>/(</w:t>
-      </w:r>
-      <w:proofErr w:type="gramEnd"/>
-      <w:r>
-        <w:rPr>
-          <w:rFonts w:asciiTheme="majorHAnsi" w:hAnsiTheme="majorHAnsi" w:cstheme="majorHAnsi"/>
-          <w:szCs w:val="24"/>
-        </w:rPr>
-        <w:t>n + z²). A claim of accuracy at least 95% with 95% confidence requires the Wilson lower bound to reach 95%, which occurs at n = 73 (73/76.84 = 0.950). For two-sided significance against the 0.95 null, n = 100 gives p = 0.010. In power terms (80%): n = 77 detects a 15% absolute defect (p = 0.80), n = 142 detects 10%, and n = 436 detects 5%. The chosen n = 100 therefore detects an absolute defect of about 12.5% at 80% power, holds the Wilson lower bound at 96.3%, and gives a one-sided binomial p = 0.006 and a two-sided p = 0.010. T10 breakdown (25 pairs × 4 question types, all 100 passed): role 25/25, direction 25/25, evidence tier 25/25, supporting PMID 25/25. T11 breakdown: not-recorded 32/32 (8 pairs × 4 types), out-of-scope and fabrication refusal 68/68. Audit volume: T10 = 100 answers × 5 checks = 500; T11 = 32 not-recorded checks plus 68 refusal checks × 2 = 168; 668 checks in total, all passed.</w:t>
+      <w:r>
+        <w:t>Minimal source and insufficient-data directness. For a gene–entity pair with no recorded PMID, the synthesis must state that no PMID is recorded and name the source database; for a pair with an INSUFFICIENT_DATA mechanistic classification, it must say so directly rather than expand empty fields. Across 100 cases of each, the correct behavior was observed in all 100 (100%; 95% CI 96.4–100%).</w:t>
       </w:r>
     </w:p>
     <w:p>
@@ -7564,54 +7656,45 @@
         <w:spacing w:after="0" w:line="240" w:lineRule="auto"/>
         <w:rPr>
           <w:rFonts w:asciiTheme="majorHAnsi" w:hAnsiTheme="majorHAnsi" w:cstheme="majorHAnsi"/>
-          <w:b/>
-          <w:bCs/>
-          <w:szCs w:val="24"/>
-        </w:rPr>
-      </w:pPr>
+          <w:szCs w:val="24"/>
+        </w:rPr>
+      </w:pPr>
+      <w:r>
+        <w:rPr>
+          <w:rFonts w:asciiTheme="majorHAnsi" w:hAnsiTheme="majorHAnsi" w:cstheme="majorHAnsi"/>
+          <w:szCs w:val="24"/>
+        </w:rPr>
+        <w:t>The board achieves 100% golden accuracy, 100% census accuracy, 100% fact-stability, a 0.047% governance violation rate, and 98.7% articulation conformity, with every violation traceable and logged. The module is ready for integration into the RCDome application as an independent component.</w:t>
+      </w:r>
     </w:p>
     <w:p>
       <w:pPr>
-        <w:spacing w:after="0" w:line="240" w:lineRule="auto"/>
-        <w:rPr>
-          <w:rFonts w:asciiTheme="majorHAnsi" w:hAnsiTheme="majorHAnsi" w:cstheme="majorHAnsi"/>
-          <w:b/>
-          <w:bCs/>
-          <w:szCs w:val="24"/>
-        </w:rPr>
-      </w:pPr>
-      <w:r>
-        <w:rPr>
-          <w:rFonts w:asciiTheme="majorHAnsi" w:hAnsiTheme="majorHAnsi" w:cstheme="majorHAnsi"/>
-          <w:b/>
-          <w:bCs/>
-          <w:szCs w:val="24"/>
-        </w:rPr>
-        <w:t>Code corrections</w:t>
-      </w:r>
+        <w:pStyle w:val="Ttulo1"/>
+        <w:spacing w:before="0" w:line="240" w:lineRule="auto"/>
+        <w:rPr>
+          <w:rFonts w:cstheme="majorHAnsi"/>
+          <w:sz w:val="24"/>
+          <w:szCs w:val="24"/>
+        </w:rPr>
+      </w:pPr>
     </w:p>
     <w:p>
       <w:pPr>
-        <w:spacing w:after="0" w:line="240" w:lineRule="auto"/>
-        <w:rPr>
-          <w:rFonts w:asciiTheme="majorHAnsi" w:hAnsiTheme="majorHAnsi" w:cstheme="majorHAnsi"/>
-          <w:szCs w:val="24"/>
-        </w:rPr>
-      </w:pPr>
-      <w:r>
-        <w:rPr>
-          <w:rFonts w:asciiTheme="majorHAnsi" w:hAnsiTheme="majorHAnsi" w:cstheme="majorHAnsi"/>
-          <w:szCs w:val="24"/>
-        </w:rPr>
-        <w:t xml:space="preserve">Six defects were found and fixed during validation: (1) the violation-type mapping had mislabeled the hedging and query checks and contained a dead branch, so hedge and query counts were reported incorrectly; (2) every failed check is now </w:t>
-      </w:r>
-      <w:r>
-        <w:rPr>
-          <w:rFonts w:asciiTheme="majorHAnsi" w:hAnsiTheme="majorHAnsi" w:cstheme="majorHAnsi"/>
-          <w:szCs w:val="24"/>
-        </w:rPr>
-        <w:lastRenderedPageBreak/>
-        <w:t>logged with its pair, check identifier, name, and exact detail rather than only tallies; (3) the scrub now removes markdown bold markers; (4) entities with the sentinel category CORE_PENDING are no longer falsely flagged, which corrected census accuracy from 51/53 to 53/53; (5) the query-count articulation check now applies only to synthesis and negative reports, not to census lookups; and (6) the matrix policy check now ignores extracellular matrix, mitochondrial matrix, and matrix metalloproteinase.</w:t>
+        <w:pStyle w:val="Ttulo1"/>
+        <w:spacing w:before="0" w:line="240" w:lineRule="auto"/>
+        <w:rPr>
+          <w:rFonts w:cstheme="majorHAnsi"/>
+          <w:sz w:val="24"/>
+          <w:szCs w:val="24"/>
+        </w:rPr>
+      </w:pPr>
+      <w:r>
+        <w:rPr>
+          <w:rFonts w:cstheme="majorHAnsi"/>
+          <w:sz w:val="24"/>
+          <w:szCs w:val="24"/>
+        </w:rPr>
+        <w:t>Supplementary Figure Legends</w:t>
       </w:r>
     </w:p>
     <w:p>
@@ -7619,104 +7702,51 @@
         <w:spacing w:after="0" w:line="240" w:lineRule="auto"/>
         <w:rPr>
           <w:rFonts w:asciiTheme="majorHAnsi" w:hAnsiTheme="majorHAnsi" w:cstheme="majorHAnsi"/>
-          <w:szCs w:val="24"/>
-        </w:rPr>
-      </w:pPr>
+          <w:bCs/>
+          <w:szCs w:val="24"/>
+        </w:rPr>
+      </w:pPr>
+      <w:r>
+        <w:rPr>
+          <w:rFonts w:asciiTheme="majorHAnsi" w:hAnsiTheme="majorHAnsi" w:cstheme="majorHAnsi"/>
+          <w:b/>
+          <w:szCs w:val="24"/>
+        </w:rPr>
+        <w:t xml:space="preserve">Supplementary Figure S1. </w:t>
+      </w:r>
+      <w:r>
+        <w:rPr>
+          <w:rFonts w:asciiTheme="majorHAnsi" w:hAnsiTheme="majorHAnsi" w:cstheme="majorHAnsi"/>
+          <w:bCs/>
+          <w:szCs w:val="24"/>
+        </w:rPr>
+        <w:t>Database contribution and multi-database corroboration. (A) Number of gene–RCD associations contributed by each of the 20 source databases (log2-scaled axis; exact counts printed at the end of each bar). (B) Number of source databases per association: 10,009 associations rest on a single source, 6,313 are corroborated by two sources, and the count declines steeply with additional sources; the long tail up to 14 sources marks the best-corroborated associations (e.g., the canonical executors), which carry the strongest multi-database agreement.</w:t>
+      </w:r>
     </w:p>
     <w:p>
-      <w:r>
-        <w:t>Minimal source and insufficient-data directness. For a gene–entity pair with no recorded PMID, the synthesis must state that no PMID is recorded and name the source database; for a pair with an INSUFFICIENT_DATA mechanistic classification, it must say so directly rather than expand empty fields. Across 100 cases of each, the correct behavior was observed in all 100 (100%; 95% CI 96.4–100%).</w:t>
-      </w:r>
+      <w:pPr>
+        <w:spacing w:after="0" w:line="240" w:lineRule="auto"/>
+        <w:rPr>
+          <w:rFonts w:asciiTheme="majorHAnsi" w:hAnsiTheme="majorHAnsi" w:cstheme="majorHAnsi"/>
+          <w:szCs w:val="24"/>
+        </w:rPr>
+      </w:pPr>
     </w:p>
     <w:p>
-      <w:r>
-        <w:t>English-only policy. The Board and Q&amp;A answer only in English; a query in any other language must receive the exact refusal sentence. Across 100 non-English queries (Portuguese, Spanish, French), all 100 were refused correctly (100%; 95% CI 96.4–100%).</w:t>
-      </w:r>
-    </w:p>
-    <w:p>
-      <w:r>
-        <w:t>Context fidelity. The Board receives the structured payload (role, direction, mechanistic class, evidence tier, required_for_death) for the queried gene–entity pair, and the prose must not contradict those fields. Across 100 pairs, no contradiction was observed (100%; 95% CI 96.4–100%).</w:t>
-      </w:r>
-    </w:p>
-    <w:p>
-      <w:r>
-        <w:t>Reference discipline. Because a synthesis may cite both gene–RCD association evidence and entity-level definitions, the two citation levels must never be interchanged: a gene–RCD statement must cite the gene-specific association PMID, and a definition statement must cite the entity founding PMID. Across 100 associations, the synthesis separated the two levels correctly in all 100 cases (100%; 95% CI 96.4–100%).</w:t>
-      </w:r>
-    </w:p>
-    <w:p>
-      <w:r>
-        <w:t>The Board and Q&amp;A were benchmarked on random, seed-reproducible samples of n = 100 gene–entity pairs or queries, with the exact binomial 95% confidence interval (Clopper–Pearson).</w:t>
-      </w:r>
-    </w:p>
-    <w:p>
-      <w:r>
-        <w:rPr>
+      <w:pPr>
+        <w:spacing w:after="0" w:line="240" w:lineRule="auto"/>
+        <w:rPr>
+          <w:rFonts w:asciiTheme="majorHAnsi" w:hAnsiTheme="majorHAnsi" w:cstheme="majorHAnsi"/>
+          <w:szCs w:val="24"/>
+        </w:rPr>
+      </w:pPr>
+      <w:r>
+        <w:rPr>
+          <w:rFonts w:asciiTheme="majorHAnsi" w:hAnsiTheme="majorHAnsi" w:cstheme="majorHAnsi"/>
           <w:b/>
-        </w:rPr>
-        <w:t>Post-review regression benchmarks</w:t>
-      </w:r>
-    </w:p>
-    <w:p>
-      <w:pPr>
-        <w:spacing w:after="0" w:line="240" w:lineRule="auto"/>
-        <w:rPr>
-          <w:rFonts w:asciiTheme="majorHAnsi" w:hAnsiTheme="majorHAnsi" w:cstheme="majorHAnsi"/>
-          <w:szCs w:val="24"/>
-        </w:rPr>
-      </w:pPr>
-      <w:r>
-        <w:rPr>
-          <w:rFonts w:asciiTheme="majorHAnsi" w:hAnsiTheme="majorHAnsi" w:cstheme="majorHAnsi"/>
-          <w:szCs w:val="24"/>
-        </w:rPr>
-        <w:t>The board achieves 100% golden accuracy, 100% census accuracy, 100% fact-stability, a 0.047% governance violation rate, and 98.7% articulation conformity, with every violation traceable and logged. The module is ready for integration into the RCDome application as an independent component.</w:t>
-      </w:r>
-    </w:p>
-    <w:p>
-      <w:pPr>
-        <w:pStyle w:val="Ttulo1"/>
-        <w:spacing w:before="0" w:line="240" w:lineRule="auto"/>
-        <w:rPr>
-          <w:rFonts w:cstheme="majorHAnsi"/>
-          <w:sz w:val="24"/>
-          <w:szCs w:val="24"/>
-        </w:rPr>
-      </w:pPr>
-    </w:p>
-    <w:p>
-      <w:pPr>
-        <w:pStyle w:val="Ttulo1"/>
-        <w:spacing w:before="0" w:line="240" w:lineRule="auto"/>
-        <w:rPr>
-          <w:rFonts w:cstheme="majorHAnsi"/>
-          <w:sz w:val="24"/>
-          <w:szCs w:val="24"/>
-        </w:rPr>
-      </w:pPr>
-      <w:r>
-        <w:rPr>
-          <w:rFonts w:cstheme="majorHAnsi"/>
-          <w:sz w:val="24"/>
-          <w:szCs w:val="24"/>
-        </w:rPr>
-        <w:t>Supplementary Figure Legends</w:t>
-      </w:r>
-    </w:p>
-    <w:p>
-      <w:pPr>
-        <w:spacing w:after="0" w:line="240" w:lineRule="auto"/>
-        <w:rPr>
-          <w:rFonts w:asciiTheme="majorHAnsi" w:hAnsiTheme="majorHAnsi" w:cstheme="majorHAnsi"/>
-          <w:szCs w:val="24"/>
-        </w:rPr>
-      </w:pPr>
-      <w:r>
-        <w:rPr>
-          <w:rFonts w:asciiTheme="majorHAnsi" w:hAnsiTheme="majorHAnsi" w:cstheme="majorHAnsi"/>
-          <w:b/>
-          <w:szCs w:val="24"/>
-        </w:rPr>
-        <w:t xml:space="preserve">Supplementary Figure S1. </w:t>
+          <w:szCs w:val="24"/>
+        </w:rPr>
+        <w:t xml:space="preserve">Supplementary Figure S2. Mechanistic associations per source, stacked by RCD entity ontological level. </w:t>
       </w:r>
       <w:r>
         <w:rPr>
@@ -7724,31 +7754,7 @@
           <w:bCs/>
           <w:szCs w:val="24"/>
         </w:rPr>
-        <w:t>Database contribution and multi-database corroboration. (A) Number of gene–RCD associations contributed by each of the 20 source databases (log2-scaled axis; exact counts printed at the end of each bar). (B) Number of source databases per association: 10,009 associations rest on a single source, 6,313 are corroborated by two sources, and the count declines steeply with additional sources; the long tail up to 14 sources marks the best-corroborated associations (e.g., the canonical executors), which carry the strongest multi-database agreement.</w:t>
-      </w:r>
-    </w:p>
-    <w:p>
-      <w:pPr>
-        <w:spacing w:after="0" w:line="240" w:lineRule="auto"/>
-        <w:rPr>
-          <w:rFonts w:asciiTheme="majorHAnsi" w:hAnsiTheme="majorHAnsi" w:cstheme="majorHAnsi"/>
-          <w:szCs w:val="24"/>
-        </w:rPr>
-      </w:pPr>
-      <w:r>
-        <w:rPr>
-          <w:rFonts w:asciiTheme="majorHAnsi" w:hAnsiTheme="majorHAnsi" w:cstheme="majorHAnsi"/>
-          <w:b/>
-          <w:szCs w:val="24"/>
-        </w:rPr>
-        <w:t>Supplementary Figure S2. Mechanistic associations per source, stacked by RCD entity ontological level. Each bar shows the number of gene–RCD associations classified as mechanistically involved by the DeepSeek chain-of-thought run (cot_mechanistic = YES), segmented by the ontological level of the corresponding RCD entity: L1 modalities (16 entities), L2 subtypes (5), L3 triggers (2), L4 functional/contextual (11), and L5 generic/umbrella/legacy/taxon/emerging (19). Colors follow the same concordant palette as Figure 4. The total number of mechanistic associations is printed at the end of each bar, ranging from 2 (Elicit Alert) to 6,452 (Rodrigues et al. 2025).</w:t>
-      </w:r>
-      <w:r>
-        <w:rPr>
-          <w:rFonts w:asciiTheme="majorHAnsi" w:hAnsiTheme="majorHAnsi" w:cstheme="majorHAnsi"/>
-          <w:bCs/>
-          <w:szCs w:val="24"/>
-        </w:rPr>
+        <w:t>Each bar shows the number of gene–RCD associations classified as mechanistically involved by the DeepSeek chain-of-thought run (cot_mechanistic = YES), segmented by the ontological level of the corresponding RCD entity: L1 modalities (16 entities), L2 subtypes (5), L3 triggers (2), L4 functional/contextual (11), and L5 generic/umbrella/legacy/taxon/emerging (19). Colors follow the same concordant palette as Figure 4. The total number of mechanistic associations is printed at the end of each bar, ranging from 2 (Elicit Alert) to 6,452 (Rodrigues et al. 2025).</w:t>
       </w:r>
     </w:p>
     <w:sectPr>

</xml_diff>

<commit_message>
Repo audit: fix 67->71 columns in CHANGELOG; re-sync manuscript + supplementary + tables
</commit_message>
<xml_diff>
--- a/docs/supplementary/RCDome_manuscript_V026_supplementary_information.docx
+++ b/docs/supplementary/RCDome_manuscript_V026_supplementary_information.docx
@@ -247,30 +247,17 @@
         </w:rPr>
         <w:t xml:space="preserve">: Enrique Medina-Acosta: </w:t>
       </w:r>
-      <w:r>
-        <w:fldChar w:fldCharType="begin"/>
-      </w:r>
-      <w:r>
-        <w:rPr>
-          <w:lang w:val="pt-BR"/>
-        </w:rPr>
-        <w:instrText>HYPERLINK "mailto:quique@uenf.br"</w:instrText>
-      </w:r>
-      <w:r>
-        <w:fldChar w:fldCharType="separate"/>
-      </w:r>
-      <w:r>
-        <w:rPr>
-          <w:rStyle w:val="Hyperlink"/>
-          <w:rFonts w:asciiTheme="majorHAnsi" w:hAnsiTheme="majorHAnsi" w:cstheme="majorHAnsi"/>
-          <w:szCs w:val="24"/>
-          <w:lang w:val="pt-BR"/>
-        </w:rPr>
-        <w:t>quique@uenf.br</w:t>
-      </w:r>
-      <w:r>
-        <w:fldChar w:fldCharType="end"/>
-      </w:r>
+      <w:hyperlink r:id="rId8" w:history="1">
+        <w:r>
+          <w:rPr>
+            <w:rStyle w:val="Hyperlink"/>
+            <w:rFonts w:asciiTheme="majorHAnsi" w:hAnsiTheme="majorHAnsi" w:cstheme="majorHAnsi"/>
+            <w:szCs w:val="24"/>
+            <w:lang w:val="pt-BR"/>
+          </w:rPr>
+          <w:t>quique@uenf.br</w:t>
+        </w:r>
+      </w:hyperlink>
     </w:p>
     <w:p>
       <w:pPr>
@@ -327,30 +314,17 @@
         </w:rPr>
         <w:t xml:space="preserve">Emanuell Rodrigues de Souza: </w:t>
       </w:r>
-      <w:r>
-        <w:fldChar w:fldCharType="begin"/>
-      </w:r>
-      <w:r>
-        <w:rPr>
-          <w:lang w:val="pt-BR"/>
-        </w:rPr>
-        <w:instrText>HYPERLINK "mailto:souza.ers00@gmail.com"</w:instrText>
-      </w:r>
-      <w:r>
-        <w:fldChar w:fldCharType="separate"/>
-      </w:r>
-      <w:r>
-        <w:rPr>
-          <w:rStyle w:val="Hyperlink"/>
-          <w:rFonts w:asciiTheme="majorHAnsi" w:hAnsiTheme="majorHAnsi" w:cstheme="majorHAnsi"/>
-          <w:szCs w:val="24"/>
-          <w:lang w:val="pt-BR"/>
-        </w:rPr>
-        <w:t>souza.ers00@gmail.com</w:t>
-      </w:r>
-      <w:r>
-        <w:fldChar w:fldCharType="end"/>
-      </w:r>
+      <w:hyperlink r:id="rId9" w:history="1">
+        <w:r>
+          <w:rPr>
+            <w:rStyle w:val="Hyperlink"/>
+            <w:rFonts w:asciiTheme="majorHAnsi" w:hAnsiTheme="majorHAnsi" w:cstheme="majorHAnsi"/>
+            <w:szCs w:val="24"/>
+            <w:lang w:val="pt-BR"/>
+          </w:rPr>
+          <w:t>souza.ers00@gmail.com</w:t>
+        </w:r>
+      </w:hyperlink>
     </w:p>
     <w:p>
       <w:pPr>
@@ -369,30 +343,17 @@
         </w:rPr>
         <w:t xml:space="preserve">Victor dos Santos Lopes: </w:t>
       </w:r>
-      <w:r>
-        <w:fldChar w:fldCharType="begin"/>
-      </w:r>
-      <w:r>
-        <w:rPr>
-          <w:lang w:val="pt-BR"/>
-        </w:rPr>
-        <w:instrText>HYPERLINK "mailto:victor94santos.lopes@gmail.com"</w:instrText>
-      </w:r>
-      <w:r>
-        <w:fldChar w:fldCharType="separate"/>
-      </w:r>
-      <w:r>
-        <w:rPr>
-          <w:rStyle w:val="Hyperlink"/>
-          <w:rFonts w:asciiTheme="majorHAnsi" w:hAnsiTheme="majorHAnsi" w:cstheme="majorHAnsi"/>
-          <w:szCs w:val="24"/>
-          <w:lang w:val="pt-BR"/>
-        </w:rPr>
-        <w:t>victor94santos.lopes@gmail.com</w:t>
-      </w:r>
-      <w:r>
-        <w:fldChar w:fldCharType="end"/>
-      </w:r>
+      <w:hyperlink r:id="rId10" w:history="1">
+        <w:r>
+          <w:rPr>
+            <w:rStyle w:val="Hyperlink"/>
+            <w:rFonts w:asciiTheme="majorHAnsi" w:hAnsiTheme="majorHAnsi" w:cstheme="majorHAnsi"/>
+            <w:szCs w:val="24"/>
+            <w:lang w:val="pt-BR"/>
+          </w:rPr>
+          <w:t>victor94santos.lopes@gmail.com</w:t>
+        </w:r>
+      </w:hyperlink>
     </w:p>
     <w:p>
       <w:pPr>
@@ -411,30 +372,17 @@
         </w:rPr>
         <w:t xml:space="preserve">Higor Almeida Cordeiro Nogueira: </w:t>
       </w:r>
-      <w:r>
-        <w:fldChar w:fldCharType="begin"/>
-      </w:r>
-      <w:r>
-        <w:rPr>
-          <w:lang w:val="pt-BR"/>
-        </w:rPr>
-        <w:instrText>HYPERLINK "mailto:higoralmeida1995@gmail.com"</w:instrText>
-      </w:r>
-      <w:r>
-        <w:fldChar w:fldCharType="separate"/>
-      </w:r>
-      <w:r>
-        <w:rPr>
-          <w:rStyle w:val="Hyperlink"/>
-          <w:rFonts w:asciiTheme="majorHAnsi" w:hAnsiTheme="majorHAnsi" w:cstheme="majorHAnsi"/>
-          <w:szCs w:val="24"/>
-          <w:lang w:val="pt-BR"/>
-        </w:rPr>
-        <w:t>higoralmeida1995@gmail.com</w:t>
-      </w:r>
-      <w:r>
-        <w:fldChar w:fldCharType="end"/>
-      </w:r>
+      <w:hyperlink r:id="rId11" w:history="1">
+        <w:r>
+          <w:rPr>
+            <w:rStyle w:val="Hyperlink"/>
+            <w:rFonts w:asciiTheme="majorHAnsi" w:hAnsiTheme="majorHAnsi" w:cstheme="majorHAnsi"/>
+            <w:szCs w:val="24"/>
+            <w:lang w:val="pt-BR"/>
+          </w:rPr>
+          <w:t>higoralmeida1995@gmail.com</w:t>
+        </w:r>
+      </w:hyperlink>
     </w:p>
     <w:p>
       <w:pPr>
@@ -451,7 +399,7 @@
         </w:rPr>
         <w:t xml:space="preserve">Enrique Medina-Acosta: </w:t>
       </w:r>
-      <w:hyperlink r:id="rId8" w:history="1">
+      <w:hyperlink r:id="rId12" w:history="1">
         <w:r>
           <w:rPr>
             <w:rStyle w:val="Hyperlink"/>
@@ -480,7 +428,7 @@
           <w:vertAlign w:val="superscript"/>
         </w:rPr>
         <w:sectPr>
-          <w:headerReference w:type="default" r:id="rId9"/>
+          <w:headerReference w:type="default" r:id="rId13"/>
           <w:pgSz w:w="11906" w:h="16838"/>
           <w:pgMar w:top="1417" w:right="1417" w:bottom="1417" w:left="1417" w:header="720" w:footer="720" w:gutter="0"/>
           <w:cols w:space="720"/>
@@ -4050,19 +3998,8 @@
           <w:szCs w:val="24"/>
           <w:lang w:val="fr-029"/>
         </w:rPr>
-        <w:t xml:space="preserve"> (L1</w:t>
-      </w:r>
-      <w:proofErr w:type="gramStart"/>
-      <w:r>
-        <w:rPr>
-          <w:rFonts w:asciiTheme="majorHAnsi" w:hAnsiTheme="majorHAnsi" w:cstheme="majorHAnsi"/>
-          <w:color w:val="auto"/>
-          <w:szCs w:val="24"/>
-          <w:lang w:val="fr-029"/>
-        </w:rPr>
-        <w:t>);</w:t>
-      </w:r>
-      <w:proofErr w:type="gramEnd"/>
+        <w:t xml:space="preserve"> (L1);</w:t>
+      </w:r>
     </w:p>
     <w:p>
       <w:r>
@@ -4218,23 +4155,13 @@
           <w:szCs w:val="24"/>
         </w:rPr>
       </w:pPr>
-      <w:proofErr w:type="gramStart"/>
-      <w:r>
-        <w:rPr>
-          <w:rFonts w:asciiTheme="majorHAnsi" w:hAnsiTheme="majorHAnsi" w:cstheme="majorHAnsi"/>
-          <w:color w:val="auto"/>
-          <w:szCs w:val="24"/>
-        </w:rPr>
-        <w:t>Thus</w:t>
-      </w:r>
-      <w:proofErr w:type="gramEnd"/>
-      <w:r>
-        <w:rPr>
-          <w:rFonts w:asciiTheme="majorHAnsi" w:hAnsiTheme="majorHAnsi" w:cstheme="majorHAnsi"/>
-          <w:color w:val="auto"/>
-          <w:szCs w:val="24"/>
-        </w:rPr>
-        <w:t xml:space="preserve"> the headline count of 53 is a count of </w:t>
+      <w:r>
+        <w:rPr>
+          <w:rFonts w:asciiTheme="majorHAnsi" w:hAnsiTheme="majorHAnsi" w:cstheme="majorHAnsi"/>
+          <w:color w:val="auto"/>
+          <w:szCs w:val="24"/>
+        </w:rPr>
+        <w:t xml:space="preserve">Thus the headline count of 53 is a count of </w:t>
       </w:r>
       <w:r>
         <w:rPr>
@@ -5177,23 +5104,7 @@
                 <w:rFonts w:asciiTheme="majorHAnsi" w:hAnsiTheme="majorHAnsi" w:cstheme="majorHAnsi"/>
                 <w:szCs w:val="24"/>
               </w:rPr>
-              <w:t>1,383.7 million (phase2b_audit_</w:t>
-            </w:r>
-            <w:proofErr w:type="gramStart"/>
-            <w:r>
-              <w:rPr>
-                <w:rFonts w:asciiTheme="majorHAnsi" w:hAnsiTheme="majorHAnsi" w:cstheme="majorHAnsi"/>
-                <w:szCs w:val="24"/>
-              </w:rPr>
-              <w:t>report.json</w:t>
-            </w:r>
-            <w:proofErr w:type="gramEnd"/>
-            <w:r>
-              <w:rPr>
-                <w:rFonts w:asciiTheme="majorHAnsi" w:hAnsiTheme="majorHAnsi" w:cstheme="majorHAnsi"/>
-                <w:szCs w:val="24"/>
-              </w:rPr>
-              <w:t>)</w:t>
+              <w:t>1,383.7 million (phase2b_audit_report.json)</w:t>
             </w:r>
           </w:p>
         </w:tc>
@@ -7476,23 +7387,7 @@
           <w:rFonts w:asciiTheme="majorHAnsi" w:hAnsiTheme="majorHAnsi" w:cstheme="majorHAnsi"/>
           <w:szCs w:val="24"/>
         </w:rPr>
-        <w:t xml:space="preserve">The Q&amp;A submodule was benchmarked with the same statistical machinery as the board benchmark (point estimate, Wilson 95% CI, binomial test against a 0.95 null), using deepseek-chat, temperature 0.3, a 1500-token reply cap, and the full retrieval-augmented prompt. Two tests were run. T10 positive accuracy (n = 100; 25 golden executor or regulator gene–form pairs, each queried on role, direction, evidence tier, and supporting PMID) audited five checks per answer: the correct fact is cited, the RCDome source is named, the interpretation is hedged, the disclaimer is appended, and no PMID absent from the data is cited; the result was 100/100 = 100% (Wilson 95% CI 96.3–100%, binomial p = 0.010). T11 negative controls (n = 100; 8 not-recorded pairs queried on the same four types, plus 68 out-of-scope or fabrication queries) were all reported as absent or refused without a hallucinated PMID; the result was 100/100 = 100% (Wilson 95% CI 96.3–100%, binomial p = 0.010). The significance of the Q&amp;A submodule is that it makes the board a full-coverage interface rather than a single-entity viewer: the static layer keeps the complete gene–entity index and the dynamic layer </w:t>
-      </w:r>
-      <w:proofErr w:type="gramStart"/>
-      <w:r>
-        <w:rPr>
-          <w:rFonts w:asciiTheme="majorHAnsi" w:hAnsiTheme="majorHAnsi" w:cstheme="majorHAnsi"/>
-          <w:szCs w:val="24"/>
-        </w:rPr>
-        <w:t>retrieves</w:t>
-      </w:r>
-      <w:proofErr w:type="gramEnd"/>
-      <w:r>
-        <w:rPr>
-          <w:rFonts w:asciiTheme="majorHAnsi" w:hAnsiTheme="majorHAnsi" w:cstheme="majorHAnsi"/>
-          <w:szCs w:val="24"/>
-        </w:rPr>
-        <w:t xml:space="preserve"> the full four-dimension records on demand, so the Q&amp;A answers across all 53 entities and all 9,265 genes without funneling the data. Every classification (MECHANISTIC, LITERATURE_GAP, CONTEXT_GAP, CO_OCCURRENCE, DATABASE_ONLY, INSUFFICIENT_DATA) remains reachable, and a gene recorded as an executor in one form and a regulator in another is shown with both records (for example, BAX as a mechanistic executor in apoptosis with PMID 17235284, together with its co-occurrence annotations in necroptosis and pyroptosis and its insufficient-data annotations in autosis, erebosis, and oncosis). The 100% positive and negative results recorded zero hallucinated PMIDs across the benchmark, demonstrating that full coverage and zero observed hallucination were achieved together in the same module.</w:t>
+        <w:t>The Q&amp;A submodule was benchmarked with the same statistical machinery as the board benchmark (point estimate, Wilson 95% CI, binomial test against a 0.95 null), using deepseek-chat, temperature 0.3, a 1500-token reply cap, and the full retrieval-augmented prompt. Two tests were run. T10 positive accuracy (n = 100; 25 golden executor or regulator gene–form pairs, each queried on role, direction, evidence tier, and supporting PMID) audited five checks per answer: the correct fact is cited, the RCDome source is named, the interpretation is hedged, the disclaimer is appended, and no PMID absent from the data is cited; the result was 100/100 = 100% (Wilson 95% CI 96.3–100%, binomial p = 0.010). T11 negative controls (n = 100; 8 not-recorded pairs queried on the same four types, plus 68 out-of-scope or fabrication queries) were all reported as absent or refused without a hallucinated PMID; the result was 100/100 = 100% (Wilson 95% CI 96.3–100%, binomial p = 0.010). The significance of the Q&amp;A submodule is that it makes the board a full-coverage interface rather than a single-entity viewer: the static layer keeps the complete gene–entity index and the dynamic layer retrieves the full four-dimension records on demand, so the Q&amp;A answers across all 53 entities and all 9,265 genes without funneling the data. Every classification (MECHANISTIC, LITERATURE_GAP, CONTEXT_GAP, CO_OCCURRENCE, DATABASE_ONLY, INSUFFICIENT_DATA) remains reachable, and a gene recorded as an executor in one form and a regulator in another is shown with both records (for example, BAX as a mechanistic executor in apoptosis with PMID 17235284, together with its co-occurrence annotations in necroptosis and pyroptosis and its insufficient-data annotations in autosis, erebosis, and oncosis). The 100% positive and negative results recorded zero hallucinated PMIDs across the benchmark, demonstrating that full coverage and zero observed hallucination were achieved together in the same module.</w:t>
       </w:r>
     </w:p>
     <w:p>
@@ -7526,39 +7421,7 @@
           <w:rFonts w:asciiTheme="majorHAnsi" w:hAnsiTheme="majorHAnsi" w:cstheme="majorHAnsi"/>
           <w:szCs w:val="24"/>
         </w:rPr>
-        <w:t xml:space="preserve"> The Q&amp;A tests use the same sample-size formulas as the board benchmark: proportion 95% CI n = z²·p·(1−p)/E² (z = 1.96); detect a defect Δ with 80% power n = (zα+z</w:t>
-      </w:r>
-      <w:proofErr w:type="gramStart"/>
-      <w:r>
-        <w:rPr>
-          <w:rFonts w:asciiTheme="majorHAnsi" w:hAnsiTheme="majorHAnsi" w:cstheme="majorHAnsi"/>
-          <w:szCs w:val="24"/>
-        </w:rPr>
-        <w:t>β)²</w:t>
-      </w:r>
-      <w:proofErr w:type="gramEnd"/>
-      <w:r>
-        <w:rPr>
-          <w:rFonts w:asciiTheme="majorHAnsi" w:hAnsiTheme="majorHAnsi" w:cstheme="majorHAnsi"/>
-          <w:szCs w:val="24"/>
-        </w:rPr>
-        <w:t>·2·p̄·(1−p̄)/Δ² (zβ = 0.84); Wilson 95% CI lower bound for 100% observed n</w:t>
-      </w:r>
-      <w:proofErr w:type="gramStart"/>
-      <w:r>
-        <w:rPr>
-          <w:rFonts w:asciiTheme="majorHAnsi" w:hAnsiTheme="majorHAnsi" w:cstheme="majorHAnsi"/>
-          <w:szCs w:val="24"/>
-        </w:rPr>
-        <w:t>/(</w:t>
-      </w:r>
-      <w:proofErr w:type="gramEnd"/>
-      <w:r>
-        <w:rPr>
-          <w:rFonts w:asciiTheme="majorHAnsi" w:hAnsiTheme="majorHAnsi" w:cstheme="majorHAnsi"/>
-          <w:szCs w:val="24"/>
-        </w:rPr>
-        <w:t>n + z²). A claim of accuracy at least 95% with 95% confidence requires the Wilson lower bound to reach 95%, which occurs at n = 73 (73/76.84 = 0.950). For two-sided significance against the 0.95 null, n = 100 gives p = 0.010. In power terms (80%): n = 77 detects a 15% absolute defect (p = 0.80), n = 142 detects 10%, and n = 436 detects 5%. The chosen n = 100 therefore detects an absolute defect of about 12.5% at 80% power, holds the Wilson lower bound at 96.3%, and gives a one-sided binomial p = 0.006 and a two-sided p = 0.010. T10 breakdown (25 pairs × 4 question types, all 100 passed): role 25/25, direction 25/25, evidence tier 25/25, supporting PMID 25/25. T11 breakdown: not-recorded 32/32 (8 pairs × 4 types), out-of-scope and fabrication refusal 68/68. Audit volume: T10 = 100 answers × 5 checks = 500; T11 = 32 not-recorded checks plus 68 refusal checks × 2 = 168; 668 checks in total, all passed.</w:t>
+        <w:t xml:space="preserve"> The Q&amp;A tests use the same sample-size formulas as the board benchmark: proportion 95% CI n = z²·p·(1−p)/E² (z = 1.96); detect a defect Δ with 80% power n = (zα+zβ)²·2·p̄·(1−p̄)/Δ² (zβ = 0.84); Wilson 95% CI lower bound for 100% observed n/(n + z²). A claim of accuracy at least 95% with 95% confidence requires the Wilson lower bound to reach 95%, which occurs at n = 73 (73/76.84 = 0.950). For two-sided significance against the 0.95 null, n = 100 gives p = 0.010. In power terms (80%): n = 77 detects a 15% absolute defect (p = 0.80), n = 142 detects 10%, and n = 436 detects 5%. The chosen n = 100 therefore detects an absolute defect of about 12.5% at 80% power, holds the Wilson lower bound at 96.3%, and gives a one-sided binomial p = 0.006 and a two-sided p = 0.010. T10 breakdown (25 pairs × 4 question types, all 100 passed): role 25/25, direction 25/25, evidence tier 25/25, supporting PMID 25/25. T11 breakdown: not-recorded 32/32 (8 pairs × 4 types), out-of-scope and fabrication refusal 68/68. Audit volume: T10 = 100 answers × 5 checks = 500; T11 = 32 not-recorded checks plus 68 refusal checks × 2 = 168; 668 checks in total, all passed.</w:t>
       </w:r>
     </w:p>
     <w:p>
@@ -7633,22 +7496,50 @@
     </w:p>
     <w:p>
       <w:r>
-        <w:t>Reference discipline. Because a synthesis may cite both gene–RCD association evidence and entity-level definitions, the two citation levels must never be interchanged: a gene–RCD statement must cite the gene-specific association PMID, and a definition statement must cite the entity founding PMID. Across 100 associations, the synthesis separated the two levels correctly in all 100 cases (100%; 95% CI 96.4–100%).</w:t>
+        <w:rPr>
+          <w:b/>
+          <w:bCs/>
+        </w:rPr>
+        <w:t>Reference discipline.</w:t>
+      </w:r>
+      <w:r>
+        <w:t xml:space="preserve"> Because a synthesis may cite both gene–RCD association evidence and entity-level definitions, the two citation levels must never be interchanged: a gene–RCD statement must cite the gene-specific association PMID, and a definition statement must cite the entity founding PMID. Across 100 associations, the synthesis separated the two levels correctly in all 100 cases (100%; 95% CI 96.4–100%).</w:t>
       </w:r>
     </w:p>
     <w:p>
       <w:r>
-        <w:t>Context fidelity. The Board receives the structured payload (role, direction, mechanistic class, evidence tier, required_for_death) for the queried gene–entity pair, and the prose must not contradict those fields. Across 100 pairs, no contradiction was observed (100%; 95% CI 96.4–100%).</w:t>
+        <w:rPr>
+          <w:b/>
+          <w:bCs/>
+        </w:rPr>
+        <w:t>Context fidelity</w:t>
+      </w:r>
+      <w:r>
+        <w:t>. The Board receives the structured payload (role, direction, mechanistic class, evidence tier, required_for_death) for the queried gene–entity pair, and the prose must not contradict those fields. Across 100 pairs, no contradiction was observed (100%; 95% CI 96.4–100%).</w:t>
       </w:r>
     </w:p>
     <w:p>
       <w:r>
-        <w:t>English-only policy. The Board and Q&amp;A answer only in English; a query in any other language must receive the exact refusal sentence. Across 100 non-English queries (Portuguese, Spanish, French), all 100 were refused correctly (100%; 95% CI 96.4–100%).</w:t>
+        <w:rPr>
+          <w:b/>
+          <w:bCs/>
+        </w:rPr>
+        <w:t>English-only policy</w:t>
+      </w:r>
+      <w:r>
+        <w:t>. The Board and Q&amp;A answer only in English; a query in any other language must receive the exact refusal sentence. Across 100 non-English queries (Portuguese, Spanish, French), all 100 were refused correctly (100%; 95% CI 96.4–100%).</w:t>
       </w:r>
     </w:p>
     <w:p>
       <w:r>
-        <w:t>Minimal source and insufficient-data directness. For a gene–entity pair with no recorded PMID, the synthesis must state that no PMID is recorded and name the source database; for a pair with an INSUFFICIENT_DATA mechanistic classification, it must say so directly rather than expand empty fields. Across 100 cases of each, the correct behavior was observed in all 100 (100%; 95% CI 96.4–100%).</w:t>
+        <w:rPr>
+          <w:b/>
+          <w:bCs/>
+        </w:rPr>
+        <w:t>Minimal source and insufficient-data directness</w:t>
+      </w:r>
+      <w:r>
+        <w:t>. For a gene–entity pair with no recorded PMID, the synthesis must state that no PMID is recorded and name the source database; for a pair with an INSUFFICIENT_DATA mechanistic classification, it must say so directly rather than expand empty fields. Across 100 cases of each, the correct behavior was observed in all 100 (100%; 95% CI 96.4–100%).</w:t>
       </w:r>
     </w:p>
     <w:p>
@@ -7664,7 +7555,7 @@
           <w:rFonts w:asciiTheme="majorHAnsi" w:hAnsiTheme="majorHAnsi" w:cstheme="majorHAnsi"/>
           <w:szCs w:val="24"/>
         </w:rPr>
-        <w:t>The board achieves 100% golden accuracy, 100% census accuracy, 100% fact-stability, a 0.047% governance violation rate, and 98.7% articulation conformity, with every violation traceable and logged. The module is ready for integration into the RCDome application as an independent component.</w:t>
+        <w:t xml:space="preserve">The board achieves 100% golden accuracy, 100% census accuracy, 100% fact-stability, a 0.047% governance violation rate, and 98.7% articulation conformity, with every violation traceable and logged. </w:t>
       </w:r>
     </w:p>
     <w:p>

</xml_diff>